<commit_message>
AASPCNJ01: corrige autoria/data do histórico dos registros
Nos registros de projeto, o autor do histórico passa a ser o papel
executor (R da matriz MAPA-ORG-001 §3), não "Time de Melhoria Contínua"
(que é a autoridade/A). A data do v1.0 reflete o momento real do
artefato na linha do tempo (TAP/PLA/REQ/PCP... = 01/10/2025; GDE 06/04;
ATA/CAP 07/04; ITP 15/12; CR 13-25/05; REL-VV/MED 01/06; RAC/GQA 11/06).
Edição feita direto nos .docx (preserva evidências embutidas).
CLAUDE.md: regra de autoria do histórico distingue definição × projeto.

https://claude.ai/code/session_01Lvzca1A5yJyk8RTZH29onh
</commit_message>
<xml_diff>
--- a/mps-nivel-c/oficial/04_registros/AASP_CNJ/ADAP-AASPCNJ01-001_Registro-de-Adaptacao.docx
+++ b/mps-nivel-c/oficial/04_registros/AASP_CNJ/ADAP-AASPCNJ01-001_Registro-de-Adaptacao.docx
@@ -2183,7 +2183,7 @@
                 <w:i w:val="0"/>
                 <w:sz w:val="20"/>
               </w:rPr>
-              <w:t>11/06/2026</w:t>
+              <w:t>01/10/2025</w:t>
             </w:r>
           </w:p>
         </w:tc>
@@ -2208,7 +2208,7 @@
                 <w:i w:val="0"/>
                 <w:sz w:val="20"/>
               </w:rPr>
-              <w:t>Time de Melhoria Contínua</w:t>
+              <w:t>Cézar Hiraki Velázquez (Tech Lead) e Abraão Oliveira (Gerente de Projeto)</w:t>
             </w:r>
           </w:p>
         </w:tc>
@@ -2233,7 +2233,7 @@
                 <w:i w:val="0"/>
                 <w:sz w:val="20"/>
               </w:rPr>
-              <w:t>Registro de adaptação consolidado a partir do Registro de Projeto AASP_CNJ v1.0 (08/06/2026).</w:t>
+              <w:t>Registro de adaptação do processo-padrão ao projeto.</w:t>
             </w:r>
           </w:p>
         </w:tc>

</xml_diff>